<commit_message>
Quellen-Angaben am Ende ohne Zeilenabstand
Neue Standardregel: Quellenlisten am Ende eines Dokuments (Fakten-Quellen,
Quellen) laufen jetzt immer als enge Gruppe ohne Leerzeile dazwischen. In
Email-nach-Absage und Drei-Aengste-Zielgruppe umgesetzt.

Co-Authored-By: Claude Sonnet 5 <noreply@anthropic.com>
Claude-Session: https://claude.ai/code/session_01DeqSdBatYE6t9FA6GS9TPf
</commit_message>
<xml_diff>
--- a/vertrieb/Recognize-You-Drei-Aengste-Zielgruppe.docx
+++ b/vertrieb/Recognize-You-Drei-Aengste-Zielgruppe.docx
@@ -323,19 +323,6 @@
     <w:p>
       <w:pPr>
         <w:spacing w:after="0" w:before="0"/>
-      </w:pPr>
-      <w:r>
-        <w:rPr>
-          <w:rFonts w:ascii="Calibri" w:cs="Calibri" w:eastAsia="Calibri" w:hAnsi="Calibri"/>
-          <w:sz w:val="22"/>
-          <w:szCs w:val="22"/>
-        </w:rPr>
-        <w:t xml:space="preserve"/>
-      </w:r>
-    </w:p>
-    <w:p>
-      <w:pPr>
-        <w:spacing w:after="0" w:before="0"/>
         <w:ind w:left="106"/>
       </w:pPr>
       <w:r>
@@ -357,19 +344,6 @@
           <w:szCs w:val="22"/>
         </w:rPr>
         <w:t xml:space="preserve">Harvard Business Review / STRIVE Magazine: Einsamkeit an der Spitze</w:t>
-      </w:r>
-    </w:p>
-    <w:p>
-      <w:pPr>
-        <w:spacing w:after="0" w:before="0"/>
-      </w:pPr>
-      <w:r>
-        <w:rPr>
-          <w:rFonts w:ascii="Calibri" w:cs="Calibri" w:eastAsia="Calibri" w:hAnsi="Calibri"/>
-          <w:sz w:val="22"/>
-          <w:szCs w:val="22"/>
-        </w:rPr>
-        <w:t xml:space="preserve"/>
       </w:r>
     </w:p>
     <w:p>

</xml_diff>